<commit_message>
v1: radar de seguimiento, prediccion del tiro y disparar solo con el canon alineado
</commit_message>
<xml_diff>
--- a/memoria/E1_parte2_reglas.docx
+++ b/memoria/E1_parte2_reglas.docx
@@ -473,6 +473,50 @@
               <w:rPr>
                 <w:sz w:val="18"/>
               </w:rPr>
+              <w:t>self._rival_vel, self._rival_dir</w:t>
+            </w:r>
+          </w:p>
+        </w:tc>
+        <w:tc>
+          <w:tcPr>
+            <w:tcW w:type="dxa" w:w="1701"/>
+          </w:tcPr>
+          <w:p>
+            <w:r/>
+            <w:r>
+              <w:rPr>
+                <w:sz w:val="18"/>
+              </w:rPr>
+              <w:t>R8</w:t>
+            </w:r>
+          </w:p>
+        </w:tc>
+        <w:tc>
+          <w:tcPr>
+            <w:tcW w:type="dxa" w:w="5556"/>
+          </w:tcPr>
+          <w:p>
+            <w:r/>
+            <w:r>
+              <w:rPr>
+                <w:sz w:val="18"/>
+              </w:rPr>
+              <w:t>Velocidad y dirección del rival. Permiten estimar dónde estará cuando llegue la bala, en vez de disparar a donde estaba.</w:t>
+            </w:r>
+          </w:p>
+        </w:tc>
+      </w:tr>
+      <w:tr>
+        <w:tc>
+          <w:tcPr>
+            <w:tcW w:type="dxa" w:w="2381"/>
+          </w:tcPr>
+          <w:p>
+            <w:r/>
+            <w:r>
+              <w:rPr>
+                <w:sz w:val="18"/>
+              </w:rPr>
               <w:t>self._ultimo_escaneo</w:t>
             </w:r>
           </w:p>
@@ -487,7 +531,7 @@
               <w:rPr>
                 <w:sz w:val="18"/>
               </w:rPr>
-              <w:t>visto</w:t>
+              <w:t>visto, R8</w:t>
             </w:r>
           </w:p>
         </w:tc>
@@ -501,7 +545,7 @@
               <w:rPr>
                 <w:sz w:val="18"/>
               </w:rPr>
-              <w:t>Turno del último escaneo. Sirve para saber si la información del rival sigue siendo válida.</w:t>
+              <w:t>Turno del último escaneo. Sirve para saber si la información del rival sigue siendo válida y cuántos turnos hay que extrapolar su posición.</w:t>
             </w:r>
           </w:p>
         </w:tc>
@@ -510,7 +554,7 @@
     <w:p/>
     <w:p>
       <w:r>
-        <w:t>No usamos la energía, la velocidad ni la dirección del rival. Se registran en el CSV y las analizaremos en E2, pero para este sistema de reglas con la distancia y la posición es suficiente y el sistema queda más fácil de entender y depurar.</w:t>
+        <w:t>No usamos la energía del rival. Se registra en el CSV y la analizaremos en E2, pero para este sistema de reglas no cambia ninguna decisión y el sistema queda más fácil de entender y depurar.</w:t>
       </w:r>
     </w:p>
     <w:p>
@@ -775,6 +819,52 @@
     </w:p>
     <w:p>
       <w:pPr>
+        <w:pStyle w:val="Heading2"/>
+      </w:pPr>
+      <w:r>
+        <w:t>6.5. El radar: barrer o seguir</w:t>
+      </w:r>
+    </w:p>
+    <w:p>
+      <w:r>
+        <w:t>El radar no es una regla de decisión, es la fuente de hechos, pero cómo lo movemos cambia mucho la calidad de esos hechos. El esqueleto del enunciado barre 45º siempre; nosotros lo hacemos en dos modos:</w:t>
+      </w:r>
+    </w:p>
+    <w:p>
+      <w:pPr>
+        <w:pStyle w:val="ListBullet"/>
+      </w:pPr>
+      <w:r>
+        <w:rPr>
+          <w:b/>
+        </w:rPr>
+        <w:t xml:space="preserve">Buscar: </w:t>
+      </w:r>
+      <w:r>
+        <w:t>Si no tenemos rival "visto": barrer 45º por turno (vuelta completa cada 8 turnos, de ahí N = 8).</w:t>
+      </w:r>
+    </w:p>
+    <w:p>
+      <w:pPr>
+        <w:pStyle w:val="ListBullet"/>
+      </w:pPr>
+      <w:r>
+        <w:rPr>
+          <w:b/>
+        </w:rPr>
+        <w:t xml:space="preserve">Seguir: </w:t>
+      </w:r>
+      <w:r>
+        <w:t>Si lo tenemos visto: girar el radar hacia su última posición más 20º de margen, alternando el lado. Así el haz pasa por encima del rival todos los turnos y lo volvemos a escanear cada turno, en vez de cada 8. Si el rival se sale del haz, a los 8 turnos visto pasa a falso y volvemos a barrer.</w:t>
+      </w:r>
+    </w:p>
+    <w:p>
+      <w:r>
+        <w:t>La consecuencia es que en combate los hechos del rival tienen normalmente 0 ó 1 turno de antigüedad, y N = 8 queda como red de seguridad para el caso peor.</w:t>
+      </w:r>
+    </w:p>
+    <w:p>
+      <w:pPr>
         <w:pStyle w:val="Heading1"/>
       </w:pPr>
       <w:r>
@@ -783,7 +873,7 @@
     </w:p>
     <w:p>
       <w:r>
-        <w:t>El sistema tiene 12 reglas en dos grupos. En el grupo de movimiento solo gana una regla por turno (if/elif en orden de prioridad). En el grupo del cañón también gana una sola regla de disparo, pero el grupo entero se evalúa en el mismo turno que el movimiento, porque en Robocode moverse y disparar son acciones simultáneas. El radar barre siempre 45º por turno: no es una regla, es la fuente de hechos.</w:t>
+        <w:t>El sistema tiene 12 reglas en dos grupos. En el grupo de movimiento solo gana una regla por turno (if/elif en orden de prioridad). En el grupo del cañón también gana una sola regla de disparo, pero el grupo entero se evalúa en el mismo turno que el movimiento, porque en Robocode moverse y disparar son acciones simultáneas. El radar (apartado 6.5) no es una regla: es la fuente de hechos.</w:t>
       </w:r>
     </w:p>
     <w:p>
@@ -1527,7 +1617,7 @@
               <w:rPr>
                 <w:sz w:val="18"/>
               </w:rPr>
-              <w:t>girar el cañón hacia la última posición del rival</w:t>
+              <w:t>girar el cañón hacia donde estará el rival cuando llegue la bala (posición + velocidad × dirección × turnos de vuelo)</w:t>
             </w:r>
           </w:p>
         </w:tc>
@@ -1555,7 +1645,7 @@
               <w:rPr>
                 <w:sz w:val="18"/>
               </w:rPr>
-              <w:t>Apuntar. No gasta energía ni depende del calor, así que se hace siempre que hay objetivo.</w:t>
+              <w:t>Apuntar con predicción. No gasta energía ni depende del calor, así que se hace siempre que hay objetivo.</w:t>
             </w:r>
           </w:p>
         </w:tc>
@@ -1585,7 +1675,7 @@
               <w:rPr>
                 <w:sz w:val="18"/>
               </w:rPr>
-              <w:t>visto y cañón frío (gun_heat == 0) y energía &lt; 20</w:t>
+              <w:t>visto, cañón frío y alineado, energía &lt; 20</w:t>
             </w:r>
           </w:p>
         </w:tc>
@@ -1657,7 +1747,7 @@
               <w:rPr>
                 <w:sz w:val="18"/>
               </w:rPr>
-              <w:t>visto y cañón frío y distancia &lt; 150</w:t>
+              <w:t>visto, cañón frío y alineado, distancia &lt; 150</w:t>
             </w:r>
           </w:p>
         </w:tc>
@@ -1729,7 +1819,7 @@
               <w:rPr>
                 <w:sz w:val="18"/>
               </w:rPr>
-              <w:t>visto y cañón frío y 150 ≤ distancia ≤ 400</w:t>
+              <w:t>visto, cañón frío y alineado, 150 ≤ distancia ≤ 400</w:t>
             </w:r>
           </w:p>
         </w:tc>
@@ -1801,7 +1891,7 @@
               <w:rPr>
                 <w:sz w:val="18"/>
               </w:rPr>
-              <w:t>visto y cañón frío y distancia &gt; 400</w:t>
+              <w:t>visto, cañón frío y alineado, distancia &gt; 400</w:t>
             </w:r>
           </w:p>
         </w:tc>
@@ -1852,7 +1942,7 @@
     <w:p/>
     <w:p>
       <w:r>
-        <w:t>Si el cañón está caliente no se activa ninguna regla de disparo: el bot apunta (R8) y espera a que gun_heat vuelva a 0.</w:t>
+        <w:t>"Cañón frío" es gun_heat == 0 y "alineado" es que al cañón le falte menos que medio ancho de bot para apuntar al punto previsto. Si no se cumple alguna de las dos, no se activa ninguna regla de disparo: el bot apunta (R8) y espera al turno siguiente. Así no gastamos energía en balas que salen mientras el cañón todavía está girando.</w:t>
       </w:r>
     </w:p>
     <w:p>
@@ -2142,6 +2232,138 @@
                 <w:sz w:val="18"/>
               </w:rPr>
               <w:t>set_fire() no dispara si hay calor, así que evaluar las reglas de disparo antes sería inútil. gun_heat va de 0 a ≈1,6.</w:t>
+            </w:r>
+          </w:p>
+        </w:tc>
+      </w:tr>
+      <w:tr>
+        <w:tc>
+          <w:tcPr>
+            <w:tcW w:type="dxa" w:w="1701"/>
+          </w:tcPr>
+          <w:p>
+            <w:r/>
+            <w:r>
+              <w:rPr>
+                <w:sz w:val="18"/>
+              </w:rPr>
+              <w:t>Cañón alineado</w:t>
+            </w:r>
+          </w:p>
+        </w:tc>
+        <w:tc>
+          <w:tcPr>
+            <w:tcW w:type="dxa" w:w="1361"/>
+          </w:tcPr>
+          <w:p>
+            <w:r/>
+            <w:r>
+              <w:rPr>
+                <w:sz w:val="18"/>
+              </w:rPr>
+              <w:t>&lt; atan(18 / distancia), mínimo 3º</w:t>
+            </w:r>
+          </w:p>
+        </w:tc>
+        <w:tc>
+          <w:tcPr>
+            <w:tcW w:type="dxa" w:w="6576"/>
+          </w:tcPr>
+          <w:p>
+            <w:r/>
+            <w:r>
+              <w:rPr>
+                <w:sz w:val="18"/>
+              </w:rPr>
+              <w:t>18 px es medio ancho de bot: si el error del cañón es menor que ese ángulo, la bala entra dentro del rival aunque no esté perfectamente centrada. A 150 px son 6,8º y a 400 px 2,6º; el mínimo de 3º evita que de lejos nunca lleguemos a disparar. El cañón gira hasta 20º por turno, así que normalmente se alinea en 1 ó 2 turnos.</w:t>
+            </w:r>
+          </w:p>
+        </w:tc>
+      </w:tr>
+      <w:tr>
+        <w:tc>
+          <w:tcPr>
+            <w:tcW w:type="dxa" w:w="1701"/>
+          </w:tcPr>
+          <w:p>
+            <w:r/>
+            <w:r>
+              <w:rPr>
+                <w:sz w:val="18"/>
+              </w:rPr>
+              <w:t>Predicción del tiro</w:t>
+            </w:r>
+          </w:p>
+        </w:tc>
+        <w:tc>
+          <w:tcPr>
+            <w:tcW w:type="dxa" w:w="1361"/>
+          </w:tcPr>
+          <w:p>
+            <w:r/>
+            <w:r>
+              <w:rPr>
+                <w:sz w:val="18"/>
+              </w:rPr>
+              <w:t>lineal</w:t>
+            </w:r>
+          </w:p>
+        </w:tc>
+        <w:tc>
+          <w:tcPr>
+            <w:tcW w:type="dxa" w:w="6576"/>
+          </w:tcPr>
+          <w:p>
+            <w:r/>
+            <w:r>
+              <w:rPr>
+                <w:sz w:val="18"/>
+              </w:rPr>
+              <w:t>Suponemos que el rival sigue recto a la misma velocidad durante los turnos que tarda la bala (distancia / velocidad de la bala) más los turnos desde el último escaneo. Es la predicción más simple posible y ya evita fallar a un rival que se mueve de lado. El punto previsto se recorta a la arena porque el rival no puede salir de ella.</w:t>
+            </w:r>
+          </w:p>
+        </w:tc>
+      </w:tr>
+      <w:tr>
+        <w:tc>
+          <w:tcPr>
+            <w:tcW w:type="dxa" w:w="1701"/>
+          </w:tcPr>
+          <w:p>
+            <w:r/>
+            <w:r>
+              <w:rPr>
+                <w:sz w:val="18"/>
+              </w:rPr>
+              <w:t>Radar extra</w:t>
+            </w:r>
+          </w:p>
+        </w:tc>
+        <w:tc>
+          <w:tcPr>
+            <w:tcW w:type="dxa" w:w="1361"/>
+          </w:tcPr>
+          <w:p>
+            <w:r/>
+            <w:r>
+              <w:rPr>
+                <w:sz w:val="18"/>
+              </w:rPr>
+              <w:t>20º</w:t>
+            </w:r>
+          </w:p>
+        </w:tc>
+        <w:tc>
+          <w:tcPr>
+            <w:tcW w:type="dxa" w:w="6576"/>
+          </w:tcPr>
+          <w:p>
+            <w:r/>
+            <w:r>
+              <w:rPr>
+                <w:sz w:val="18"/>
+              </w:rPr>
+              <w:t>Al seguir al rival, el radar se pasa 20º de largo alternando el lado. Así el haz barre unos 40º por encima del rival cada turno (por debajo del máximo de 45º) y lo re-escaneamos aunque se mueva.</w:t>
             </w:r>
           </w:p>
         </w:tc>
@@ -2758,7 +2980,7 @@
               <w:rPr>
                 <w:sz w:val="18"/>
               </w:rPr>
-              <w:t>R8 si visto; R12 si además cañón frío</w:t>
+              <w:t>R8 si visto; R12 si además cañón frío y alineado</w:t>
             </w:r>
           </w:p>
         </w:tc>
@@ -2802,7 +3024,7 @@
               <w:rPr>
                 <w:sz w:val="18"/>
               </w:rPr>
-              <w:t>R8 + R9/R10/R11 si visto y cañón frío</w:t>
+              <w:t>R8 + R9/R10/R11 si visto, cañón frío y alineado</w:t>
             </w:r>
           </w:p>
         </w:tc>
@@ -2890,7 +3112,7 @@
               <w:rPr>
                 <w:sz w:val="18"/>
               </w:rPr>
-              <w:t>R8 + R11 si cañón frío</w:t>
+              <w:t>R8 + R11 si cañón frío y alineado</w:t>
             </w:r>
           </w:p>
         </w:tc>
@@ -2934,7 +3156,7 @@
               <w:rPr>
                 <w:sz w:val="18"/>
               </w:rPr>
-              <w:t>R8 + R9 si cañón frío</w:t>
+              <w:t>R8 + R9 si cañón frío y alineado</w:t>
             </w:r>
           </w:p>
         </w:tc>
@@ -2978,7 +3200,7 @@
               <w:rPr>
                 <w:sz w:val="18"/>
               </w:rPr>
-              <w:t>R8 + R10 si cañón frío</w:t>
+              <w:t>R8 + R10 si cañón frío y alineado</w:t>
             </w:r>
           </w:p>
         </w:tc>
@@ -3022,7 +3244,7 @@
               <w:rPr>
                 <w:sz w:val="18"/>
               </w:rPr>
-              <w:t>ninguna: no hay objetivo, el radar sigue barriendo</w:t>
+              <w:t>ninguna: no hay objetivo, el radar vuelve a barrer</w:t>
             </w:r>
           </w:p>
         </w:tc>
@@ -3054,7 +3276,7 @@
         <w:t xml:space="preserve">Cañón: </w:t>
       </w:r>
       <w:r>
-        <w:t>Las cuatro reglas de disparo cubren todas las distancias y el caso de poca energía. Cuando no se ve al rival o el cañón está caliente no se dispara, y eso es una decisión, no un hueco: no hay nada a lo que disparar o el disparo no saldría. En esos turnos el bot sigue haciendo algo (moverse y barrer el radar).</w:t>
+        <w:t>Las cuatro reglas de disparo cubren todas las distancias y el caso de poca energía. Cuando no se ve al rival, el cañón está caliente o todavía no está alineado no se dispara, y eso es una decisión, no un hueco: no hay nada a lo que disparar, el disparo no saldría o saldría desviado. En esos turnos el bot sigue haciendo algo (moverse, apuntar y mover el radar).</w:t>
       </w:r>
     </w:p>
     <w:p>
@@ -3068,7 +3290,7 @@
         <w:t xml:space="preserve">Radar: </w:t>
       </w:r>
       <w:r>
-        <w:t>El radar gira 45º todos los turnos, fuera de las reglas, así que el bot nunca se queda sin percibir.</w:t>
+        <w:t>Se mueve todos los turnos, fuera de las reglas: sigue al rival si lo tiene y barre si no, así que el bot nunca se queda sin percibir.</w:t>
       </w:r>
     </w:p>
     <w:p>
@@ -3109,7 +3331,7 @@
         <w:t xml:space="preserve">Motor: </w:t>
       </w:r>
       <w:r>
-        <w:t>run() es el motor de inferencias: cada turno calcula visto, evalúa el grupo de movimiento con if/elif/else, después el grupo del cañón, gira el radar y llama a go(). Cada bloque lleva su comentario # R1 … # R12.</w:t>
+        <w:t>run() es el motor de inferencias: cada turno calcula visto, evalúa el grupo de movimiento con if/elif/else, después el grupo del cañón (elige la potencia con R9–R12, apunta al punto previsto con R8 y dispara si está frío y alineado), mueve el radar y llama a go(). Cada bloque lleva su comentario # R1 … # R12.</w:t>
       </w:r>
     </w:p>
     <w:p>

</xml_diff>

<commit_message>
v1: marcha atras para alejarse, zigzag mas corto y evitar la pared antes de chocar
</commit_message>
<xml_diff>
--- a/memoria/E1_parte2_reglas.docx
+++ b/memoria/E1_parte2_reglas.docx
@@ -1013,7 +1013,7 @@
               <w:rPr>
                 <w:sz w:val="18"/>
               </w:rPr>
-              <w:t>girar hacia la esquina más alejada del rival (con 100 px de margen a la pared) y avanzar</w:t>
+              <w:t>ir hacia la esquina más alejada del rival (con 100 px de margen a la pared), marcha atrás si queda a la espalda</w:t>
             </w:r>
           </w:p>
         </w:tc>
@@ -1143,7 +1143,7 @@
               <w:rPr>
                 <w:sz w:val="18"/>
               </w:rPr>
-              <w:t>acabamos de chocar con la pared</w:t>
+              <w:t>hemos chocado con la pared o, siguiendo así, en 80 px nos salimos del margen de 50 px</w:t>
             </w:r>
           </w:p>
         </w:tc>
@@ -1157,7 +1157,7 @@
               <w:rPr>
                 <w:sz w:val="18"/>
               </w:rPr>
-              <w:t>invertir el sentido y avanzar</w:t>
+              <w:t>invertir el sentido, girar 30º y avanzar</w:t>
             </w:r>
           </w:p>
         </w:tc>
@@ -1185,7 +1185,7 @@
               <w:rPr>
                 <w:sz w:val="18"/>
               </w:rPr>
-              <w:t>Rebote: no quedarnos empujando contra el borde.</w:t>
+              <w:t>Rebote preventivo: no llegar a la pared (cada choque a velocidad 8 cuesta 3 de energía) ni quedarnos empujando contra ella.</w:t>
             </w:r>
           </w:p>
         </w:tc>
@@ -1229,7 +1229,7 @@
               <w:rPr>
                 <w:sz w:val="18"/>
               </w:rPr>
-              <w:t>girar hacia el rival y avanzar</w:t>
+              <w:t>ir hacia el rival (marcha atrás si queda a la espalda)</w:t>
             </w:r>
           </w:p>
         </w:tc>
@@ -1301,7 +1301,7 @@
               <w:rPr>
                 <w:sz w:val="18"/>
               </w:rPr>
-              <w:t>girar 180º respecto al rival y avanzar</w:t>
+              <w:t>ir en dirección contraria al rival (marcha atrás si lo tenemos delante)</w:t>
             </w:r>
           </w:p>
         </w:tc>
@@ -1373,7 +1373,7 @@
               <w:rPr>
                 <w:sz w:val="18"/>
               </w:rPr>
-              <w:t>ponerse perpendicular al rival y avanzar; cada 20 turnos cambiar de sentido</w:t>
+              <w:t>ponerse perpendicular al rival y avanzar; cada 10 turnos cambiar de sentido</w:t>
             </w:r>
           </w:p>
         </w:tc>
@@ -2437,7 +2437,7 @@
               <w:rPr>
                 <w:sz w:val="18"/>
               </w:rPr>
-              <w:t>20 turnos</w:t>
+              <w:t>10 turnos</w:t>
             </w:r>
           </w:p>
         </w:tc>
@@ -2451,7 +2451,95 @@
               <w:rPr>
                 <w:sz w:val="18"/>
               </w:rPr>
-              <w:t>A 8 px/turno son tramos de unos 160 px. Cambiar más a menudo hace que el bot pase mucho tiempo frenando y acelerando (acelera 1 px/turno² y frena 2), y menos a menudo nos convierte en un blanco en línea recta.</w:t>
+              <w:t>Una bala de potencia 2 tarda unos 18 turnos en recorrer 250 px. Si el rival predice nuestro movimiento suponiendo que seguimos rectos, cambiar de sentido cada 10 turnos (unos 80 px) hace que la bala llegue a donde ya no estamos. Cambiar más a menudo desaprovecha la aceleración (1 px/turno² al acelerar, 2 al frenar) y casi no nos moveríamos.</w:t>
+            </w:r>
+          </w:p>
+        </w:tc>
+      </w:tr>
+      <w:tr>
+        <w:tc>
+          <w:tcPr>
+            <w:tcW w:type="dxa" w:w="1701"/>
+          </w:tcPr>
+          <w:p>
+            <w:r/>
+            <w:r>
+              <w:rPr>
+                <w:sz w:val="18"/>
+              </w:rPr>
+              <w:t>Margen de pared / anticipo</w:t>
+            </w:r>
+          </w:p>
+        </w:tc>
+        <w:tc>
+          <w:tcPr>
+            <w:tcW w:type="dxa" w:w="1361"/>
+          </w:tcPr>
+          <w:p>
+            <w:r/>
+            <w:r>
+              <w:rPr>
+                <w:sz w:val="18"/>
+              </w:rPr>
+              <w:t>50 px / 80 px</w:t>
+            </w:r>
+          </w:p>
+        </w:tc>
+        <w:tc>
+          <w:tcPr>
+            <w:tcW w:type="dxa" w:w="6576"/>
+          </w:tcPr>
+          <w:p>
+            <w:r/>
+            <w:r>
+              <w:rPr>
+                <w:sz w:val="18"/>
+              </w:rPr>
+              <w:t>Miramos 80 px por delante (10 turnos a velocidad máxima) y si ese punto queda a menos de 50 px de una pared, invertimos antes de llegar. Así evitamos el daño del choque y no nos quedamos pegados al borde, que en el mapa del apartado 1 es la zona con +3 de coste.</w:t>
+            </w:r>
+          </w:p>
+        </w:tc>
+      </w:tr>
+      <w:tr>
+        <w:tc>
+          <w:tcPr>
+            <w:tcW w:type="dxa" w:w="1701"/>
+          </w:tcPr>
+          <w:p>
+            <w:r/>
+            <w:r>
+              <w:rPr>
+                <w:sz w:val="18"/>
+              </w:rPr>
+              <w:t>Marcha atrás</w:t>
+            </w:r>
+          </w:p>
+        </w:tc>
+        <w:tc>
+          <w:tcPr>
+            <w:tcW w:type="dxa" w:w="1361"/>
+          </w:tcPr>
+          <w:p>
+            <w:r/>
+            <w:r>
+              <w:rPr>
+                <w:sz w:val="18"/>
+              </w:rPr>
+              <w:t>si el rumbo está a más de 90º</w:t>
+            </w:r>
+          </w:p>
+        </w:tc>
+        <w:tc>
+          <w:tcPr>
+            <w:tcW w:type="dxa" w:w="6576"/>
+          </w:tcPr>
+          <w:p>
+            <w:r/>
+            <w:r>
+              <w:rPr>
+                <w:sz w:val="18"/>
+              </w:rPr>
+              <w:t>El cuerpo gira como mucho 10º por turno: dar la vuelta entera lleva unos 18 turnos avanzando en arco hacia donde no queremos (en la primera versión eso provocaba embestidas al intentar alejarnos). Si el destino queda a la espalda, giramos lo justo y vamos marcha atrás.</w:t>
             </w:r>
           </w:p>
         </w:tc>

</xml_diff>

<commit_message>
v1: apuntar a la posicion actual (la prediccion lineal acertaba la mitad) y no quedarse quieto en el refugio
</commit_message>
<xml_diff>
--- a/memoria/E1_parte2_reglas.docx
+++ b/memoria/E1_parte2_reglas.docx
@@ -473,50 +473,6 @@
               <w:rPr>
                 <w:sz w:val="18"/>
               </w:rPr>
-              <w:t>self._rival_vel, self._rival_dir</w:t>
-            </w:r>
-          </w:p>
-        </w:tc>
-        <w:tc>
-          <w:tcPr>
-            <w:tcW w:type="dxa" w:w="1701"/>
-          </w:tcPr>
-          <w:p>
-            <w:r/>
-            <w:r>
-              <w:rPr>
-                <w:sz w:val="18"/>
-              </w:rPr>
-              <w:t>R8</w:t>
-            </w:r>
-          </w:p>
-        </w:tc>
-        <w:tc>
-          <w:tcPr>
-            <w:tcW w:type="dxa" w:w="5556"/>
-          </w:tcPr>
-          <w:p>
-            <w:r/>
-            <w:r>
-              <w:rPr>
-                <w:sz w:val="18"/>
-              </w:rPr>
-              <w:t>Velocidad y dirección del rival. Permiten estimar dónde estará cuando llegue la bala, en vez de disparar a donde estaba.</w:t>
-            </w:r>
-          </w:p>
-        </w:tc>
-      </w:tr>
-      <w:tr>
-        <w:tc>
-          <w:tcPr>
-            <w:tcW w:type="dxa" w:w="2381"/>
-          </w:tcPr>
-          <w:p>
-            <w:r/>
-            <w:r>
-              <w:rPr>
-                <w:sz w:val="18"/>
-              </w:rPr>
               <w:t>self._ultimo_escaneo</w:t>
             </w:r>
           </w:p>
@@ -531,7 +487,7 @@
               <w:rPr>
                 <w:sz w:val="18"/>
               </w:rPr>
-              <w:t>visto, R8</w:t>
+              <w:t>visto</w:t>
             </w:r>
           </w:p>
         </w:tc>
@@ -545,7 +501,7 @@
               <w:rPr>
                 <w:sz w:val="18"/>
               </w:rPr>
-              <w:t>Turno del último escaneo. Sirve para saber si la información del rival sigue siendo válida y cuántos turnos hay que extrapolar su posición.</w:t>
+              <w:t>Turno del último escaneo. Sirve para saber si la información del rival sigue siendo válida.</w:t>
             </w:r>
           </w:p>
         </w:tc>
@@ -554,7 +510,7 @@
     <w:p/>
     <w:p>
       <w:r>
-        <w:t>No usamos la energía del rival. Se registra en el CSV y la analizaremos en E2, pero para este sistema de reglas no cambia ninguna decisión y el sistema queda más fácil de entender y depurar.</w:t>
+        <w:t>No usamos la energía, la velocidad ni la dirección del rival. Las dos últimas las probamos para predecir el tiro y las quitamos con datos (ver apartado 7.4); la energía se registra en el CSV y la analizaremos en E2.</w:t>
       </w:r>
     </w:p>
     <w:p>
@@ -1013,7 +969,7 @@
               <w:rPr>
                 <w:sz w:val="18"/>
               </w:rPr>
-              <w:t>ir hacia la esquina más alejada del rival (con 100 px de margen a la pared), marcha atrás si queda a la espalda</w:t>
+              <w:t>ir hacia la esquina más alejada del rival (con 100 px de margen a la pared), marcha atrás si queda a la espalda; una vez a menos de 60 px del refugio, zigzag perpendicular al rival</w:t>
             </w:r>
           </w:p>
         </w:tc>
@@ -1617,7 +1573,7 @@
               <w:rPr>
                 <w:sz w:val="18"/>
               </w:rPr>
-              <w:t>girar el cañón hacia donde estará el rival cuando llegue la bala (posición + velocidad × dirección × turnos de vuelo)</w:t>
+              <w:t>girar el cañón hacia la última posición conocida del rival</w:t>
             </w:r>
           </w:p>
         </w:tc>
@@ -1645,7 +1601,7 @@
               <w:rPr>
                 <w:sz w:val="18"/>
               </w:rPr>
-              <w:t>Apuntar con predicción. No gasta energía ni depende del calor, así que se hace siempre que hay objetivo.</w:t>
+              <w:t>Apuntar. No gasta energía ni depende del calor, así que se hace siempre que hay objetivo.</w:t>
             </w:r>
           </w:p>
         </w:tc>
@@ -2291,7 +2247,7 @@
               <w:rPr>
                 <w:sz w:val="18"/>
               </w:rPr>
-              <w:t>Predicción del tiro</w:t>
+              <w:t>Radio del refugio</w:t>
             </w:r>
           </w:p>
         </w:tc>
@@ -2305,7 +2261,7 @@
               <w:rPr>
                 <w:sz w:val="18"/>
               </w:rPr>
-              <w:t>lineal</w:t>
+              <w:t>60 px</w:t>
             </w:r>
           </w:p>
         </w:tc>
@@ -2319,7 +2275,7 @@
               <w:rPr>
                 <w:sz w:val="18"/>
               </w:rPr>
-              <w:t>Suponemos que el rival sigue recto a la misma velocidad durante los turnos que tarda la bala (distancia / velocidad de la bala) más los turnos desde el último escaneo. Es la predicción más simple posible y ya evita fallar a un rival que se mueve de lado. El punto previsto se recorta a la arena porque el rival no puede salir de ella.</w:t>
+              <w:t>Al llegar al refugio el bot no se para (un bot quieto se acierta siempre) sino que hace zigzag alrededor del punto. En las primeras batallas el 33 % de los impactos que recibíamos nos llegaban con energía &lt; 20, es decir, ya en el refugio y oscilando sobre el punto.</w:t>
             </w:r>
           </w:p>
         </w:tc>
@@ -2634,6 +2590,216 @@
       </w:tr>
     </w:tbl>
     <w:p/>
+    <w:p>
+      <w:pPr>
+        <w:pStyle w:val="Heading2"/>
+      </w:pPr>
+      <w:r>
+        <w:t>7.4. Lo que probamos y quitamos: la predicción del tiro</w:t>
+      </w:r>
+    </w:p>
+    <w:p>
+      <w:r>
+        <w:t>La primera versión de R8 apuntaba a donde iba a estar el rival suponiendo que seguía recto a su velocidad durante el vuelo de la bala (predicción lineal, usando e.speed y e.direction del escaneo). Lo comprobamos con los CSV de dos batallas de 10 rondas contra nuestro bot del torneo: para cada disparo miramos dónde estaba de verdad el rival cuando llegó la bala y recalculamos el error lateral que habría tenido la bala con distintas cantidades de adelanto.</w:t>
+      </w:r>
+    </w:p>
+    <w:tbl>
+      <w:tblPr>
+        <w:tblStyle w:val="TableGrid"/>
+        <w:tblW w:type="auto" w:w="0"/>
+        <w:tblLook w:firstColumn="1" w:firstRow="1" w:lastColumn="0" w:lastRow="0" w:noHBand="0" w:noVBand="1" w:val="04A0"/>
+      </w:tblPr>
+      <w:tblGrid>
+        <w:gridCol w:w="3324"/>
+        <w:gridCol w:w="3324"/>
+        <w:gridCol w:w="3324"/>
+      </w:tblGrid>
+      <w:tr>
+        <w:tc>
+          <w:tcPr>
+            <w:tcW w:type="dxa" w:w="3402"/>
+          </w:tcPr>
+          <w:p>
+            <w:r/>
+            <w:r>
+              <w:rPr>
+                <w:b/>
+                <w:sz w:val="18"/>
+              </w:rPr>
+              <w:t>Adelanto aplicado</w:t>
+            </w:r>
+          </w:p>
+        </w:tc>
+        <w:tc>
+          <w:tcPr>
+            <w:tcW w:type="dxa" w:w="3118"/>
+          </w:tcPr>
+          <w:p>
+            <w:r/>
+            <w:r>
+              <w:rPr>
+                <w:b/>
+                <w:sz w:val="18"/>
+              </w:rPr>
+              <w:t>Bala dentro del bot (&lt; 18 px)</w:t>
+            </w:r>
+          </w:p>
+        </w:tc>
+        <w:tc>
+          <w:tcPr>
+            <w:tcW w:type="dxa" w:w="3118"/>
+          </w:tcPr>
+          <w:p>
+            <w:r/>
+            <w:r>
+              <w:rPr>
+                <w:b/>
+                <w:sz w:val="18"/>
+              </w:rPr>
+              <w:t>Error lateral mediano</w:t>
+            </w:r>
+          </w:p>
+        </w:tc>
+      </w:tr>
+      <w:tr>
+        <w:tc>
+          <w:tcPr>
+            <w:tcW w:type="dxa" w:w="3402"/>
+          </w:tcPr>
+          <w:p>
+            <w:r/>
+            <w:r>
+              <w:rPr>
+                <w:sz w:val="18"/>
+              </w:rPr>
+              <w:t>0 (apuntar a donde está)</w:t>
+            </w:r>
+          </w:p>
+        </w:tc>
+        <w:tc>
+          <w:tcPr>
+            <w:tcW w:type="dxa" w:w="3118"/>
+          </w:tcPr>
+          <w:p>
+            <w:r/>
+            <w:r>
+              <w:rPr>
+                <w:sz w:val="18"/>
+              </w:rPr>
+              <w:t>25 %</w:t>
+            </w:r>
+          </w:p>
+        </w:tc>
+        <w:tc>
+          <w:tcPr>
+            <w:tcW w:type="dxa" w:w="3118"/>
+          </w:tcPr>
+          <w:p>
+            <w:r/>
+            <w:r>
+              <w:rPr>
+                <w:sz w:val="18"/>
+              </w:rPr>
+              <w:t>41 px</w:t>
+            </w:r>
+          </w:p>
+        </w:tc>
+      </w:tr>
+      <w:tr>
+        <w:tc>
+          <w:tcPr>
+            <w:tcW w:type="dxa" w:w="3402"/>
+          </w:tcPr>
+          <w:p>
+            <w:r/>
+            <w:r>
+              <w:rPr>
+                <w:sz w:val="18"/>
+              </w:rPr>
+              <w:t>0,5 (mitad de la predicción)</w:t>
+            </w:r>
+          </w:p>
+        </w:tc>
+        <w:tc>
+          <w:tcPr>
+            <w:tcW w:type="dxa" w:w="3118"/>
+          </w:tcPr>
+          <w:p>
+            <w:r/>
+            <w:r>
+              <w:rPr>
+                <w:sz w:val="18"/>
+              </w:rPr>
+              <w:t>23 %</w:t>
+            </w:r>
+          </w:p>
+        </w:tc>
+        <w:tc>
+          <w:tcPr>
+            <w:tcW w:type="dxa" w:w="3118"/>
+          </w:tcPr>
+          <w:p>
+            <w:r/>
+            <w:r>
+              <w:rPr>
+                <w:sz w:val="18"/>
+              </w:rPr>
+              <w:t>42 px</w:t>
+            </w:r>
+          </w:p>
+        </w:tc>
+      </w:tr>
+      <w:tr>
+        <w:tc>
+          <w:tcPr>
+            <w:tcW w:type="dxa" w:w="3402"/>
+          </w:tcPr>
+          <w:p>
+            <w:r/>
+            <w:r>
+              <w:rPr>
+                <w:sz w:val="18"/>
+              </w:rPr>
+              <w:t>1 (predicción lineal completa)</w:t>
+            </w:r>
+          </w:p>
+        </w:tc>
+        <w:tc>
+          <w:tcPr>
+            <w:tcW w:type="dxa" w:w="3118"/>
+          </w:tcPr>
+          <w:p>
+            <w:r/>
+            <w:r>
+              <w:rPr>
+                <w:sz w:val="18"/>
+              </w:rPr>
+              <w:t>13 %</w:t>
+            </w:r>
+          </w:p>
+        </w:tc>
+        <w:tc>
+          <w:tcPr>
+            <w:tcW w:type="dxa" w:w="3118"/>
+          </w:tcPr>
+          <w:p>
+            <w:r/>
+            <w:r>
+              <w:rPr>
+                <w:sz w:val="18"/>
+              </w:rPr>
+              <w:t>56 px</w:t>
+            </w:r>
+          </w:p>
+        </w:tc>
+      </w:tr>
+    </w:tbl>
+    <w:p/>
+    <w:p>
+      <w:r>
+        <w:t>La predicción lineal acertaba la mitad que apuntar directamente. La explicación es que los bots de la arena no van rectos: oscilan alrededor de un punto (avanzan y retroceden, o hacen zigzag), y en los ~18 turnos que tarda una bala en recorrer 250 px el rival ya ha dado la vuelta. Extrapolar en línea recta lo coloca donde nunca va a estar. Por eso R8 apunta a la última posición conocida, que además es la regla más simple. Con más datos (E2) se podría estudiar una predicción que tenga en cuenta la oscilación.</w:t>
+      </w:r>
+    </w:p>
     <w:p>
       <w:pPr>
         <w:pStyle w:val="Heading1"/>
@@ -3419,7 +3585,7 @@
         <w:t xml:space="preserve">Motor: </w:t>
       </w:r>
       <w:r>
-        <w:t>run() es el motor de inferencias: cada turno calcula visto, evalúa el grupo de movimiento con if/elif/else, después el grupo del cañón (elige la potencia con R9–R12, apunta al punto previsto con R8 y dispara si está frío y alineado), mueve el radar y llama a go(). Cada bloque lleva su comentario # R1 … # R12.</w:t>
+        <w:t>run() es el motor de inferencias: cada turno calcula visto, evalúa el grupo de movimiento con if/elif/else, después el grupo del cañón (elige la potencia con R9–R12, apunta con R8 y dispara si está frío y alineado), mueve el radar y llama a go(). Cada bloque lleva su comentario # R1 … # R12.</w:t>
       </w:r>
     </w:p>
     <w:p>

</xml_diff>

<commit_message>
v1: potencia 3 hasta 200 px (separado del umbral de alejarse)
</commit_message>
<xml_diff>
--- a/memoria/E1_parte2_reglas.docx
+++ b/memoria/E1_parte2_reglas.docx
@@ -1703,7 +1703,7 @@
               <w:rPr>
                 <w:sz w:val="18"/>
               </w:rPr>
-              <w:t>visto, cañón frío y alineado, distancia &lt; 150</w:t>
+              <w:t>visto, cañón frío y alineado, distancia &lt; 200</w:t>
             </w:r>
           </w:p>
         </w:tc>
@@ -1745,7 +1745,7 @@
               <w:rPr>
                 <w:sz w:val="18"/>
               </w:rPr>
-              <w:t>De cerca casi seguro que acertamos: máximo daño.</w:t>
+              <w:t>De cerca acertamos lo bastante para que compense apostar el máximo.</w:t>
             </w:r>
           </w:p>
         </w:tc>
@@ -1775,7 +1775,7 @@
               <w:rPr>
                 <w:sz w:val="18"/>
               </w:rPr>
-              <w:t>visto, cañón frío y alineado, 150 ≤ distancia ≤ 400</w:t>
+              <w:t>visto, cañón frío y alineado, 200 ≤ distancia ≤ 400</w:t>
             </w:r>
           </w:p>
         </w:tc>
@@ -2027,7 +2027,7 @@
               <w:rPr>
                 <w:sz w:val="18"/>
               </w:rPr>
-              <w:t>Distancia "cerca"</w:t>
+              <w:t>Distancia "cerca" (alejarse)</w:t>
             </w:r>
           </w:p>
         </w:tc>
@@ -2055,7 +2055,51 @@
               <w:rPr>
                 <w:sz w:val="18"/>
               </w:rPr>
-              <w:t>Son unos 4 anchos de bot. A esa distancia una bala de potencia 3 (11 px/turno) llega en unos 14 turnos, pero el rival casi no puede salirse del cono de tiro: acertamos casi seguro y por eso usamos potencia 3. Lo malo es que a él le pasa lo mismo y además hay riesgo de embestida, por eso en movimiento nos alejamos.</w:t>
+              <w:t>Son unos 4 anchos de bot. Tan cerca el rival casi no puede fallar (a 150 px una bala de potencia 3 llega en 14 turnos y el cono de tiro es muy ancho) y además hay riesgo de embestida, así que nos alejamos.</w:t>
+            </w:r>
+          </w:p>
+        </w:tc>
+      </w:tr>
+      <w:tr>
+        <w:tc>
+          <w:tcPr>
+            <w:tcW w:type="dxa" w:w="1701"/>
+          </w:tcPr>
+          <w:p>
+            <w:r/>
+            <w:r>
+              <w:rPr>
+                <w:sz w:val="18"/>
+              </w:rPr>
+              <w:t>Distancia potencia 3</w:t>
+            </w:r>
+          </w:p>
+        </w:tc>
+        <w:tc>
+          <w:tcPr>
+            <w:tcW w:type="dxa" w:w="1361"/>
+          </w:tcPr>
+          <w:p>
+            <w:r/>
+            <w:r>
+              <w:rPr>
+                <w:sz w:val="18"/>
+              </w:rPr>
+              <w:t>200</w:t>
+            </w:r>
+          </w:p>
+        </w:tc>
+        <w:tc>
+          <w:tcPr>
+            <w:tcW w:type="dxa" w:w="6576"/>
+          </w:tcPr>
+          <w:p>
+            <w:r/>
+            <w:r>
+              <w:rPr>
+                <w:sz w:val="18"/>
+              </w:rPr>
+              <w:t>En nuestras batallas contra el bot del torneo, a 150–250 px acertamos alrededor del 25 % de los disparos. Con esa tasa, la potencia 3 hace 0,25 × 16 = 4,0 de daño esperado por disparo frente a 0,25 × 10 = 2,5 la potencia 2, y también gana por turno de enfriamiento (4,0 / 16 turnos = 0,25 frente a 2,5 / 14 = 0,18). Con el umbral en 150 casi nunca llegábamos a disparar potencia 3 (5 disparos en 10 rondas) porque a esa distancia ya nos estamos alejando.</w:t>
             </w:r>
           </w:p>
         </w:tc>
@@ -2143,7 +2187,7 @@
               <w:rPr>
                 <w:sz w:val="18"/>
               </w:rPr>
-              <w:t>A menos distancia más probabilidad de acierto, así que apostamos más: potencia 3 (coste 3, daño 16) de cerca; potencia 2 (coste 2, daño 10) en la zona media; potencia 1 (coste 1, daño 4) de lejos. Todas están en el rango válido 0,1–3.</w:t>
+              <w:t>A menos distancia más probabilidad de acierto, así que apostamos más: potencia 3 (coste 3, daño 16) por debajo de 200 px; potencia 2 (coste 2, daño 10) entre 200 y 400; potencia 1 (coste 1, daño 4) más lejos. Todas están en el rango válido 0,1–3.</w:t>
             </w:r>
           </w:p>
         </w:tc>
@@ -3454,7 +3498,7 @@
               <w:rPr>
                 <w:sz w:val="18"/>
               </w:rPr>
-              <w:t>R8 + R10 si cañón frío y alineado</w:t>
+              <w:t>R8 + R9 (&lt; 200) o R10 (≥ 200) si cañón frío y alineado</w:t>
             </w:r>
           </w:p>
         </w:tc>

</xml_diff>

<commit_message>
v1: zigzag con intervalo aleatorio, invertir sentido al recibir impacto, potencia 3 de vuelta a 150
</commit_message>
<xml_diff>
--- a/memoria/E1_parte2_reglas.docx
+++ b/memoria/E1_parte2_reglas.docx
@@ -1041,7 +1041,7 @@
               <w:rPr>
                 <w:sz w:val="18"/>
               </w:rPr>
-              <w:t>girar 90º respecto a la dirección de la bala y avanzar</w:t>
+              <w:t>invertir el sentido, girar 90º respecto a la dirección de la bala y avanzar</w:t>
             </w:r>
           </w:p>
         </w:tc>
@@ -1069,7 +1069,7 @@
               <w:rPr>
                 <w:sz w:val="18"/>
               </w:rPr>
-              <w:t>Esquiva: salir de la línea de tiro del rival.</w:t>
+              <w:t>Esquiva: salir de la línea de tiro y no volver por donde el rival ya nos ha acertado.</w:t>
             </w:r>
           </w:p>
         </w:tc>
@@ -1329,7 +1329,7 @@
               <w:rPr>
                 <w:sz w:val="18"/>
               </w:rPr>
-              <w:t>ponerse perpendicular al rival y avanzar; cada 10 turnos cambiar de sentido</w:t>
+              <w:t>ponerse perpendicular al rival y avanzar; cambiar de sentido cada 8–30 turnos (intervalo al azar)</w:t>
             </w:r>
           </w:p>
         </w:tc>
@@ -1703,7 +1703,7 @@
               <w:rPr>
                 <w:sz w:val="18"/>
               </w:rPr>
-              <w:t>visto, cañón frío y alineado, distancia &lt; 200</w:t>
+              <w:t>visto, cañón frío y alineado, distancia &lt; 150</w:t>
             </w:r>
           </w:p>
         </w:tc>
@@ -1745,7 +1745,7 @@
               <w:rPr>
                 <w:sz w:val="18"/>
               </w:rPr>
-              <w:t>De cerca acertamos lo bastante para que compense apostar el máximo.</w:t>
+              <w:t>De cerca casi seguro que acertamos: máximo daño.</w:t>
             </w:r>
           </w:p>
         </w:tc>
@@ -1775,7 +1775,7 @@
               <w:rPr>
                 <w:sz w:val="18"/>
               </w:rPr>
-              <w:t>visto, cañón frío y alineado, 200 ≤ distancia ≤ 400</w:t>
+              <w:t>visto, cañón frío y alineado, 150 ≤ distancia ≤ 400</w:t>
             </w:r>
           </w:p>
         </w:tc>
@@ -2027,7 +2027,7 @@
               <w:rPr>
                 <w:sz w:val="18"/>
               </w:rPr>
-              <w:t>Distancia "cerca" (alejarse)</w:t>
+              <w:t>Distancia "cerca"</w:t>
             </w:r>
           </w:p>
         </w:tc>
@@ -2055,51 +2055,7 @@
               <w:rPr>
                 <w:sz w:val="18"/>
               </w:rPr>
-              <w:t>Son unos 4 anchos de bot. Tan cerca el rival casi no puede fallar (a 150 px una bala de potencia 3 llega en 14 turnos y el cono de tiro es muy ancho) y además hay riesgo de embestida, así que nos alejamos.</w:t>
-            </w:r>
-          </w:p>
-        </w:tc>
-      </w:tr>
-      <w:tr>
-        <w:tc>
-          <w:tcPr>
-            <w:tcW w:type="dxa" w:w="1701"/>
-          </w:tcPr>
-          <w:p>
-            <w:r/>
-            <w:r>
-              <w:rPr>
-                <w:sz w:val="18"/>
-              </w:rPr>
-              <w:t>Distancia potencia 3</w:t>
-            </w:r>
-          </w:p>
-        </w:tc>
-        <w:tc>
-          <w:tcPr>
-            <w:tcW w:type="dxa" w:w="1361"/>
-          </w:tcPr>
-          <w:p>
-            <w:r/>
-            <w:r>
-              <w:rPr>
-                <w:sz w:val="18"/>
-              </w:rPr>
-              <w:t>200</w:t>
-            </w:r>
-          </w:p>
-        </w:tc>
-        <w:tc>
-          <w:tcPr>
-            <w:tcW w:type="dxa" w:w="6576"/>
-          </w:tcPr>
-          <w:p>
-            <w:r/>
-            <w:r>
-              <w:rPr>
-                <w:sz w:val="18"/>
-              </w:rPr>
-              <w:t>En nuestras batallas contra el bot del torneo, a 150–250 px acertamos alrededor del 25 % de los disparos. Con esa tasa, la potencia 3 hace 0,25 × 16 = 4,0 de daño esperado por disparo frente a 0,25 × 10 = 2,5 la potencia 2, y también gana por turno de enfriamiento (4,0 / 16 turnos = 0,25 frente a 2,5 / 14 = 0,18). Con el umbral en 150 casi nunca llegábamos a disparar potencia 3 (5 disparos en 10 rondas) porque a esa distancia ya nos estamos alejando.</w:t>
+              <w:t>Son unos 4 anchos de bot. A esa distancia una bala de potencia 3 (11 px/turno) llega en unos 14 turnos y el cono de tiro es tan ancho que acertamos casi seguro: por eso potencia 3. Lo malo es que al rival le pasa lo mismo y además hay riesgo de embestida, por eso en movimiento nos alejamos. Probamos subir el umbral de la potencia 3 a 200 px y acertamos solo el 9 % de 55 disparos (−120 de energía en una batalla): la bala lenta llega cuando el rival ya ha cambiado de sentido. Lo dejamos en 150.</w:t>
             </w:r>
           </w:p>
         </w:tc>
@@ -2187,7 +2143,7 @@
               <w:rPr>
                 <w:sz w:val="18"/>
               </w:rPr>
-              <w:t>A menos distancia más probabilidad de acierto, así que apostamos más: potencia 3 (coste 3, daño 16) por debajo de 200 px; potencia 2 (coste 2, daño 10) entre 200 y 400; potencia 1 (coste 1, daño 4) más lejos. Todas están en el rango válido 0,1–3.</w:t>
+              <w:t>A menos distancia más probabilidad de acierto, así que apostamos más: potencia 3 (coste 3, daño 16) de cerca; potencia 2 (coste 2, daño 10) en la zona media; potencia 1 (coste 1, daño 4) de lejos. Todas están en el rango válido 0,1–3.</w:t>
             </w:r>
           </w:p>
         </w:tc>
@@ -2437,7 +2393,7 @@
               <w:rPr>
                 <w:sz w:val="18"/>
               </w:rPr>
-              <w:t>10 turnos</w:t>
+              <w:t>8–30 turnos, al azar</w:t>
             </w:r>
           </w:p>
         </w:tc>
@@ -2451,7 +2407,7 @@
               <w:rPr>
                 <w:sz w:val="18"/>
               </w:rPr>
-              <w:t>Una bala de potencia 2 tarda unos 18 turnos en recorrer 250 px. Si el rival predice nuestro movimiento suponiendo que seguimos rectos, cambiar de sentido cada 10 turnos (unos 80 px) hace que la bala llegue a donde ya no estamos. Cambiar más a menudo desaprovecha la aceleración (1 px/turno² al acelerar, 2 al frenar) y casi no nos moveríamos.</w:t>
+              <w:t>Hay dos formas de apuntarnos: a donde estamos y a donde estaremos si seguimos rectos. Con un periodo fijo de 10 turnos íbamos y volvíamos al mismo sitio justo en lo que tarda una bala (~18 turnos), y con los CSV comprobamos que un rival que disparase a "donde estamos" nos habría acertado el 60–75 % de las veces. Con tramos largos nos acierta el que predice en línea recta. Un intervalo al azar entre 8 turnos (~64 px) y 30 (~240 px) no le da un patrón a ninguno de los dos: un blanco predecible es el más fácil de acertar.</w:t>
             </w:r>
           </w:p>
         </w:tc>
@@ -3498,7 +3454,7 @@
               <w:rPr>
                 <w:sz w:val="18"/>
               </w:rPr>
-              <w:t>R8 + R9 (&lt; 200) o R10 (≥ 200) si cañón frío y alineado</w:t>
+              <w:t>R8 + R10 si cañón frío y alineado</w:t>
             </w:r>
           </w:p>
         </w:tc>

</xml_diff>